<commit_message>
UI improvements and final styling
</commit_message>
<xml_diff>
--- a/docs/spm-documentation.docx
+++ b/docs/spm-documentation.docx
@@ -204,6 +204,15 @@
         </w:rPr>
         <w:t xml:space="preserve">GitHub Link: </w:t>
       </w:r>
+      <w:r>
+        <w:rPr>
+          <w:rFonts w:ascii="Times New Roman" w:hAnsi="Times New Roman" w:cs="Times New Roman"/>
+          <w:sz w:val="32"/>
+          <w:szCs w:val="32"/>
+          <w:lang w:val="en-US"/>
+        </w:rPr>
+        <w:t>https://github.com/Gopikaa211</w:t>
+      </w:r>
     </w:p>
     <w:p>
       <w:pPr>
@@ -222,6 +231,24 @@
           <w:lang w:val="en-US"/>
         </w:rPr>
         <w:t>Website Link:</w:t>
+      </w:r>
+      <w:r>
+        <w:rPr>
+          <w:rFonts w:ascii="Times New Roman" w:hAnsi="Times New Roman" w:cs="Times New Roman"/>
+          <w:sz w:val="32"/>
+          <w:szCs w:val="32"/>
+          <w:lang w:val="en-US"/>
+        </w:rPr>
+        <w:t xml:space="preserve"> </w:t>
+      </w:r>
+      <w:r>
+        <w:rPr>
+          <w:rFonts w:ascii="Times New Roman" w:hAnsi="Times New Roman" w:cs="Times New Roman"/>
+          <w:sz w:val="32"/>
+          <w:szCs w:val="32"/>
+          <w:lang w:val="en-US"/>
+        </w:rPr>
+        <w:t>https://student-performance-manager.vercel.app</w:t>
       </w:r>
     </w:p>
     <w:p>
@@ -668,37 +695,39 @@
       <w:pPr>
         <w:rPr>
           <w:rFonts w:ascii="Times New Roman" w:hAnsi="Times New Roman" w:cs="Times New Roman"/>
-          <w:sz w:val="28"/>
-          <w:lang w:val="en-US"/>
-        </w:rPr>
-      </w:pPr>
-      <w:r>
-        <w:rPr>
-          <w:rFonts w:ascii="Times New Roman" w:hAnsi="Times New Roman" w:cs="Times New Roman"/>
-          <w:sz w:val="28"/>
-        </w:rPr>
-        <w:t>The system follows a client–server architecture where the frontend interacts with Firebase services for authentication and data storage.</w:t>
-      </w:r>
-    </w:p>
-    <w:p>
-      <w:pPr>
-        <w:rPr>
-          <w:rFonts w:ascii="Times New Roman" w:hAnsi="Times New Roman" w:cs="Times New Roman"/>
-          <w:sz w:val="32"/>
-          <w:szCs w:val="32"/>
-          <w:lang w:val="en-US"/>
-        </w:rPr>
-      </w:pPr>
-    </w:p>
-    <w:p>
-      <w:pPr>
-        <w:rPr>
-          <w:rFonts w:ascii="Times New Roman" w:hAnsi="Times New Roman" w:cs="Times New Roman"/>
-          <w:sz w:val="32"/>
-          <w:szCs w:val="32"/>
-          <w:lang w:val="en-US"/>
-        </w:rPr>
-      </w:pPr>
+          <w:sz w:val="24"/>
+          <w:szCs w:val="24"/>
+          <w:lang w:val="en-US"/>
+        </w:rPr>
+      </w:pPr>
+      <w:r>
+        <w:rPr>
+          <w:rFonts w:ascii="Times New Roman" w:hAnsi="Times New Roman" w:cs="Times New Roman"/>
+          <w:sz w:val="28"/>
+        </w:rPr>
+        <w:t>The system follows a client–server architecture where the frontend interacts with Firebase services for authentication and data storage</w:t>
+      </w:r>
+      <w:r>
+        <w:rPr>
+          <w:rFonts w:ascii="Times New Roman" w:hAnsi="Times New Roman" w:cs="Times New Roman"/>
+          <w:sz w:val="28"/>
+        </w:rPr>
+        <w:t>.</w:t>
+      </w:r>
+      <w:r>
+        <w:rPr>
+          <w:rFonts w:ascii="Times New Roman" w:hAnsi="Times New Roman" w:cs="Times New Roman"/>
+          <w:sz w:val="28"/>
+        </w:rPr>
+        <w:t xml:space="preserve"> </w:t>
+      </w:r>
+      <w:r>
+        <w:rPr>
+          <w:rFonts w:ascii="Times New Roman" w:hAnsi="Times New Roman" w:cs="Times New Roman"/>
+          <w:sz w:val="28"/>
+        </w:rPr>
+        <w:t>Firebase provides authentication and a cloud database, allowing the application to securely manage users and store student academic records without maintaining a separate backend server.</w:t>
+      </w:r>
     </w:p>
     <w:p>
       <w:pPr>
@@ -2185,11 +2214,22 @@
       <w:pPr>
         <w:rPr>
           <w:rFonts w:ascii="Times New Roman" w:hAnsi="Times New Roman" w:cs="Times New Roman"/>
-          <w:sz w:val="32"/>
-          <w:szCs w:val="32"/>
-          <w:lang w:val="en-US"/>
-        </w:rPr>
-      </w:pPr>
+          <w:b/>
+          <w:bCs/>
+          <w:sz w:val="28"/>
+          <w:lang w:val="en-US"/>
+        </w:rPr>
+      </w:pPr>
+      <w:r>
+        <w:rPr>
+          <w:rFonts w:ascii="Times New Roman" w:hAnsi="Times New Roman" w:cs="Times New Roman"/>
+          <w:b/>
+          <w:bCs/>
+          <w:sz w:val="28"/>
+          <w:lang w:val="en-US"/>
+        </w:rPr>
+        <w:t>With warnings</w:t>
+      </w:r>
     </w:p>
     <w:p>
       <w:pPr>
@@ -2272,35 +2312,35 @@
           <w:sz w:val="28"/>
           <w:lang w:val="en-US"/>
         </w:rPr>
+        <w:t>Student 2</w:t>
+      </w:r>
+      <w:r>
+        <w:rPr>
+          <w:rFonts w:ascii="Times New Roman" w:hAnsi="Times New Roman" w:cs="Times New Roman"/>
+          <w:sz w:val="28"/>
+          <w:lang w:val="en-US"/>
+        </w:rPr>
+        <w:t xml:space="preserve"> dashboard with no warnings</w:t>
+      </w:r>
+    </w:p>
+    <w:p>
+      <w:pPr>
+        <w:rPr>
+          <w:rFonts w:ascii="Times New Roman" w:hAnsi="Times New Roman" w:cs="Times New Roman"/>
+          <w:sz w:val="32"/>
+          <w:szCs w:val="32"/>
+          <w:lang w:val="en-US"/>
+        </w:rPr>
+      </w:pPr>
+      <w:r>
+        <w:rPr>
+          <w:rFonts w:ascii="Times New Roman" w:hAnsi="Times New Roman" w:cs="Times New Roman"/>
+          <w:noProof/>
+          <w:sz w:val="32"/>
+          <w:szCs w:val="32"/>
+          <w:lang w:val="en-US"/>
+        </w:rPr>
         <w:lastRenderedPageBreak/>
-        <w:t>Student 2</w:t>
-      </w:r>
-      <w:r>
-        <w:rPr>
-          <w:rFonts w:ascii="Times New Roman" w:hAnsi="Times New Roman" w:cs="Times New Roman"/>
-          <w:sz w:val="28"/>
-          <w:lang w:val="en-US"/>
-        </w:rPr>
-        <w:t xml:space="preserve"> dashboard with no warnings</w:t>
-      </w:r>
-    </w:p>
-    <w:p>
-      <w:pPr>
-        <w:rPr>
-          <w:rFonts w:ascii="Times New Roman" w:hAnsi="Times New Roman" w:cs="Times New Roman"/>
-          <w:sz w:val="32"/>
-          <w:szCs w:val="32"/>
-          <w:lang w:val="en-US"/>
-        </w:rPr>
-      </w:pPr>
-      <w:r>
-        <w:rPr>
-          <w:rFonts w:ascii="Times New Roman" w:hAnsi="Times New Roman" w:cs="Times New Roman"/>
-          <w:noProof/>
-          <w:sz w:val="32"/>
-          <w:szCs w:val="32"/>
-          <w:lang w:val="en-US"/>
-        </w:rPr>
         <w:drawing>
           <wp:inline distT="0" distB="0" distL="0" distR="0" wp14:anchorId="006F8AAD" wp14:editId="1B2406AC">
             <wp:extent cx="5971309" cy="3206750"/>
@@ -2723,41 +2763,13 @@
           <w:lang w:val="en-US"/>
         </w:rPr>
       </w:pPr>
-      <w:proofErr w:type="gramStart"/>
-      <w:r>
-        <w:rPr>
-          <w:rFonts w:ascii="Times New Roman" w:hAnsi="Times New Roman" w:cs="Times New Roman"/>
-          <w:sz w:val="28"/>
-          <w:lang w:val="en-US"/>
-        </w:rPr>
-        <w:t>students</w:t>
-      </w:r>
-      <w:proofErr w:type="gramEnd"/>
-      <w:r>
-        <w:rPr>
-          <w:rFonts w:ascii="Times New Roman" w:hAnsi="Times New Roman" w:cs="Times New Roman"/>
-          <w:sz w:val="28"/>
-          <w:lang w:val="en-US"/>
-        </w:rPr>
-        <w:t xml:space="preserve"> collection for </w:t>
-      </w:r>
-      <w:proofErr w:type="gramStart"/>
-      <w:r>
-        <w:rPr>
-          <w:rFonts w:ascii="Times New Roman" w:hAnsi="Times New Roman" w:cs="Times New Roman"/>
-          <w:sz w:val="28"/>
-          <w:lang w:val="en-US"/>
-        </w:rPr>
-        <w:t>students</w:t>
-      </w:r>
-      <w:proofErr w:type="gramEnd"/>
-      <w:r>
-        <w:rPr>
-          <w:rFonts w:ascii="Times New Roman" w:hAnsi="Times New Roman" w:cs="Times New Roman"/>
-          <w:sz w:val="28"/>
-          <w:lang w:val="en-US"/>
-        </w:rPr>
-        <w:t xml:space="preserve"> page a</w:t>
+      <w:r>
+        <w:rPr>
+          <w:rFonts w:ascii="Times New Roman" w:hAnsi="Times New Roman" w:cs="Times New Roman"/>
+          <w:sz w:val="28"/>
+          <w:lang w:val="en-US"/>
+        </w:rPr>
+        <w:t>students collection for students page a</w:t>
       </w:r>
       <w:r>
         <w:rPr>
@@ -3517,75 +3529,25 @@
       </w:pPr>
       <w:r>
         <w:rPr>
-          <w:rFonts w:ascii="Times New Roman" w:hAnsi="Times New Roman" w:cs="Times New Roman"/>
-          <w:sz w:val="28"/>
-          <w:lang w:val="en-US"/>
-        </w:rPr>
-        <w:t xml:space="preserve">Each user created is added to </w:t>
-      </w:r>
-      <w:proofErr w:type="gramStart"/>
-      <w:r>
-        <w:rPr>
-          <w:rFonts w:ascii="Times New Roman" w:hAnsi="Times New Roman" w:cs="Times New Roman"/>
-          <w:sz w:val="28"/>
-          <w:lang w:val="en-US"/>
-        </w:rPr>
-        <w:t>users</w:t>
-      </w:r>
-      <w:proofErr w:type="gramEnd"/>
-      <w:r>
-        <w:rPr>
-          <w:rFonts w:ascii="Times New Roman" w:hAnsi="Times New Roman" w:cs="Times New Roman"/>
-          <w:sz w:val="28"/>
-          <w:lang w:val="en-US"/>
-        </w:rPr>
-        <w:t xml:space="preserve"> collection with their unique ID </w:t>
-      </w:r>
-      <w:r>
-        <w:rPr>
-          <w:rFonts w:ascii="Times New Roman" w:hAnsi="Times New Roman" w:cs="Times New Roman"/>
-          <w:sz w:val="28"/>
-          <w:lang w:val="en-US"/>
-        </w:rPr>
-        <w:t>to help login with authorized access.</w:t>
-      </w:r>
-    </w:p>
-    <w:p>
-      <w:pPr>
-        <w:pStyle w:val="ListParagraph"/>
-        <w:rPr>
-          <w:rFonts w:ascii="Times New Roman" w:hAnsi="Times New Roman" w:cs="Times New Roman"/>
-          <w:b/>
-          <w:bCs/>
-          <w:sz w:val="28"/>
-          <w:lang w:val="en-US"/>
-        </w:rPr>
-      </w:pPr>
-      <w:r>
-        <w:rPr>
-          <w:rFonts w:ascii="Times New Roman" w:hAnsi="Times New Roman" w:cs="Times New Roman"/>
-          <w:b/>
-          <w:bCs/>
           <w:noProof/>
-          <w:sz w:val="28"/>
           <w:lang w:val="en-US"/>
         </w:rPr>
         <w:drawing>
-          <wp:anchor distT="0" distB="0" distL="114300" distR="114300" simplePos="0" relativeHeight="251665408" behindDoc="1" locked="0" layoutInCell="1" allowOverlap="1" wp14:anchorId="233E206B" wp14:editId="35A4EC88">
+          <wp:anchor distT="0" distB="0" distL="114300" distR="114300" simplePos="0" relativeHeight="251665408" behindDoc="1" locked="0" layoutInCell="1" allowOverlap="1" wp14:anchorId="233E206B" wp14:editId="571350D3">
             <wp:simplePos x="0" y="0"/>
             <wp:positionH relativeFrom="column">
-              <wp:posOffset>296949</wp:posOffset>
+              <wp:posOffset>152400</wp:posOffset>
             </wp:positionH>
             <wp:positionV relativeFrom="paragraph">
-              <wp:posOffset>242339</wp:posOffset>
+              <wp:posOffset>544195</wp:posOffset>
             </wp:positionV>
-            <wp:extent cx="5731510" cy="3518535"/>
-            <wp:effectExtent l="0" t="0" r="2540" b="5715"/>
+            <wp:extent cx="5731510" cy="3314700"/>
+            <wp:effectExtent l="0" t="0" r="2540" b="0"/>
             <wp:wrapTight wrapText="bothSides">
               <wp:wrapPolygon edited="0">
                 <wp:start x="0" y="0"/>
-                <wp:lineTo x="0" y="21518"/>
-                <wp:lineTo x="21538" y="21518"/>
+                <wp:lineTo x="0" y="21476"/>
+                <wp:lineTo x="21538" y="21476"/>
                 <wp:lineTo x="21538" y="0"/>
                 <wp:lineTo x="0" y="0"/>
               </wp:wrapPolygon>
@@ -3616,7 +3578,7 @@
                   <pic:spPr>
                     <a:xfrm>
                       <a:off x="0" y="0"/>
-                      <a:ext cx="5731510" cy="3518535"/>
+                      <a:ext cx="5731510" cy="3314700"/>
                     </a:xfrm>
                     <a:prstGeom prst="rect">
                       <a:avLst/>
@@ -3630,6 +3592,22 @@
             </wp14:sizeRelV>
           </wp:anchor>
         </w:drawing>
+      </w:r>
+      <w:r>
+        <w:rPr>
+          <w:rFonts w:ascii="Times New Roman" w:hAnsi="Times New Roman" w:cs="Times New Roman"/>
+          <w:sz w:val="28"/>
+          <w:lang w:val="en-US"/>
+        </w:rPr>
+        <w:t xml:space="preserve">Each user created is added to users collection with their unique ID </w:t>
+      </w:r>
+      <w:r>
+        <w:rPr>
+          <w:rFonts w:ascii="Times New Roman" w:hAnsi="Times New Roman" w:cs="Times New Roman"/>
+          <w:sz w:val="28"/>
+          <w:lang w:val="en-US"/>
+        </w:rPr>
+        <w:t>to help login with authorized access.</w:t>
       </w:r>
     </w:p>
     <w:sectPr>

</xml_diff>